<commit_message>
added UML class diagram solution
</commit_message>
<xml_diff>
--- a/Solutions/Solution_UML_Modelling.docx
+++ b/Solutions/Solution_UML_Modelling.docx
@@ -112,11 +112,9 @@
         </w:numPr>
         <w:spacing w:line="360" w:lineRule="auto"/>
       </w:pPr>
-      <w:proofErr w:type="spellStart"/>
       <w:r>
         <w:t>MenuItem</w:t>
       </w:r>
-      <w:proofErr w:type="spellEnd"/>
     </w:p>
     <w:p>
       <w:pPr>
@@ -150,11 +148,9 @@
         </w:numPr>
         <w:spacing w:line="360" w:lineRule="auto"/>
       </w:pPr>
-      <w:proofErr w:type="spellStart"/>
       <w:r>
         <w:t>OrderItem</w:t>
       </w:r>
-      <w:proofErr w:type="spellEnd"/>
     </w:p>
     <w:p>
       <w:pPr>
@@ -213,11 +209,9 @@
           <w:numId w:val="19"/>
         </w:numPr>
       </w:pPr>
-      <w:proofErr w:type="spellStart"/>
       <w:r>
         <w:t>userId</w:t>
       </w:r>
-      <w:proofErr w:type="spellEnd"/>
     </w:p>
     <w:p>
       <w:pPr>
@@ -311,11 +305,9 @@
           <w:numId w:val="21"/>
         </w:numPr>
       </w:pPr>
-      <w:proofErr w:type="spellStart"/>
       <w:r>
         <w:t>phoneNumber</w:t>
       </w:r>
-      <w:proofErr w:type="spellEnd"/>
     </w:p>
     <w:p>
       <w:r>
@@ -329,13 +321,8 @@
           <w:numId w:val="22"/>
         </w:numPr>
       </w:pPr>
-      <w:proofErr w:type="spellStart"/>
-      <w:r>
-        <w:t>placeOrder</w:t>
-      </w:r>
-      <w:proofErr w:type="spellEnd"/>
-      <w:r>
-        <w:t>()</w:t>
+      <w:r>
+        <w:t>placeOrder()</w:t>
       </w:r>
     </w:p>
     <w:p>
@@ -345,13 +332,8 @@
           <w:numId w:val="22"/>
         </w:numPr>
       </w:pPr>
-      <w:proofErr w:type="spellStart"/>
-      <w:r>
-        <w:t>viewOrderHistory</w:t>
-      </w:r>
-      <w:proofErr w:type="spellEnd"/>
-      <w:r>
-        <w:t>()</w:t>
+      <w:r>
+        <w:t>viewOrderHistory()</w:t>
       </w:r>
     </w:p>
     <w:p/>
@@ -382,11 +364,9 @@
           <w:numId w:val="23"/>
         </w:numPr>
       </w:pPr>
-      <w:proofErr w:type="spellStart"/>
       <w:r>
         <w:t>vehicleDetails</w:t>
       </w:r>
-      <w:proofErr w:type="spellEnd"/>
     </w:p>
     <w:p>
       <w:pPr>
@@ -397,11 +377,9 @@
           <w:numId w:val="23"/>
         </w:numPr>
       </w:pPr>
-      <w:proofErr w:type="spellStart"/>
       <w:r>
         <w:t>availabilityStatus</w:t>
       </w:r>
-      <w:proofErr w:type="spellEnd"/>
     </w:p>
     <w:p>
       <w:pPr>
@@ -421,13 +399,8 @@
           <w:numId w:val="24"/>
         </w:numPr>
       </w:pPr>
-      <w:proofErr w:type="spellStart"/>
-      <w:r>
-        <w:t>acceptDelivery</w:t>
-      </w:r>
-      <w:proofErr w:type="spellEnd"/>
-      <w:r>
-        <w:t>()</w:t>
+      <w:r>
+        <w:t>acceptDelivery()</w:t>
       </w:r>
     </w:p>
     <w:p>
@@ -437,13 +410,8 @@
           <w:numId w:val="24"/>
         </w:numPr>
       </w:pPr>
-      <w:proofErr w:type="spellStart"/>
-      <w:r>
-        <w:t>updateDeliveryStatus</w:t>
-      </w:r>
-      <w:proofErr w:type="spellEnd"/>
-      <w:r>
-        <w:t>()</w:t>
+      <w:r>
+        <w:t>updateDeliveryStatus()</w:t>
       </w:r>
     </w:p>
     <w:p/>
@@ -467,11 +435,9 @@
           <w:numId w:val="25"/>
         </w:numPr>
       </w:pPr>
-      <w:proofErr w:type="spellStart"/>
       <w:r>
         <w:t>restaurantId</w:t>
       </w:r>
-      <w:proofErr w:type="spellEnd"/>
     </w:p>
     <w:p>
       <w:pPr>
@@ -502,11 +468,9 @@
           <w:numId w:val="25"/>
         </w:numPr>
       </w:pPr>
-      <w:proofErr w:type="spellStart"/>
       <w:r>
         <w:t>isOpen</w:t>
       </w:r>
-      <w:proofErr w:type="spellEnd"/>
     </w:p>
     <w:p>
       <w:r>
@@ -520,13 +484,8 @@
           <w:numId w:val="26"/>
         </w:numPr>
       </w:pPr>
-      <w:proofErr w:type="spellStart"/>
-      <w:r>
-        <w:t>updateMenu</w:t>
-      </w:r>
-      <w:proofErr w:type="spellEnd"/>
-      <w:r>
-        <w:t>()</w:t>
+      <w:r>
+        <w:t>updateMenu()</w:t>
       </w:r>
     </w:p>
     <w:p>
@@ -536,13 +495,8 @@
           <w:numId w:val="26"/>
         </w:numPr>
       </w:pPr>
-      <w:proofErr w:type="spellStart"/>
-      <w:r>
-        <w:t>acceptOrder</w:t>
-      </w:r>
-      <w:proofErr w:type="spellEnd"/>
-      <w:r>
-        <w:t>()</w:t>
+      <w:r>
+        <w:t>acceptOrder()</w:t>
       </w:r>
     </w:p>
     <w:p>
@@ -552,13 +506,8 @@
           <w:numId w:val="26"/>
         </w:numPr>
       </w:pPr>
-      <w:proofErr w:type="spellStart"/>
-      <w:r>
-        <w:t>rejectOrder</w:t>
-      </w:r>
-      <w:proofErr w:type="spellEnd"/>
-      <w:r>
-        <w:t>()</w:t>
+      <w:r>
+        <w:t>rejectOrder()</w:t>
       </w:r>
     </w:p>
     <w:p/>
@@ -566,11 +515,9 @@
       <w:pPr>
         <w:pStyle w:val="Heading3"/>
       </w:pPr>
-      <w:proofErr w:type="spellStart"/>
       <w:r>
         <w:t>MenuItem</w:t>
       </w:r>
-      <w:proofErr w:type="spellEnd"/>
     </w:p>
     <w:p>
       <w:r>
@@ -584,11 +531,9 @@
           <w:numId w:val="27"/>
         </w:numPr>
       </w:pPr>
-      <w:proofErr w:type="spellStart"/>
       <w:r>
         <w:t>itemId</w:t>
       </w:r>
-      <w:proofErr w:type="spellEnd"/>
     </w:p>
     <w:p>
       <w:pPr>
@@ -635,13 +580,8 @@
           <w:numId w:val="28"/>
         </w:numPr>
       </w:pPr>
-      <w:proofErr w:type="spellStart"/>
-      <w:r>
-        <w:t>updatePrice</w:t>
-      </w:r>
-      <w:proofErr w:type="spellEnd"/>
-      <w:r>
-        <w:t>()</w:t>
+      <w:r>
+        <w:t>updatePrice()</w:t>
       </w:r>
     </w:p>
     <w:p>
@@ -651,13 +591,8 @@
           <w:numId w:val="28"/>
         </w:numPr>
       </w:pPr>
-      <w:proofErr w:type="spellStart"/>
-      <w:r>
-        <w:t>setAvailability</w:t>
-      </w:r>
-      <w:proofErr w:type="spellEnd"/>
-      <w:r>
-        <w:t>()</w:t>
+      <w:r>
+        <w:t>setAvailability()</w:t>
       </w:r>
     </w:p>
     <w:p/>
@@ -681,11 +616,9 @@
           <w:numId w:val="29"/>
         </w:numPr>
       </w:pPr>
-      <w:proofErr w:type="spellStart"/>
       <w:r>
         <w:t>orderId</w:t>
       </w:r>
-      <w:proofErr w:type="spellEnd"/>
     </w:p>
     <w:p>
       <w:pPr>
@@ -705,11 +638,9 @@
           <w:numId w:val="29"/>
         </w:numPr>
       </w:pPr>
-      <w:proofErr w:type="spellStart"/>
       <w:r>
         <w:t>totalPrice</w:t>
       </w:r>
-      <w:proofErr w:type="spellEnd"/>
     </w:p>
     <w:p>
       <w:pPr>
@@ -734,13 +665,8 @@
           <w:numId w:val="30"/>
         </w:numPr>
       </w:pPr>
-      <w:proofErr w:type="spellStart"/>
-      <w:r>
-        <w:t>calculateTotal</w:t>
-      </w:r>
-      <w:proofErr w:type="spellEnd"/>
-      <w:r>
-        <w:t>()</w:t>
+      <w:r>
+        <w:t>calculateTotal()</w:t>
       </w:r>
     </w:p>
     <w:p>
@@ -750,13 +676,8 @@
           <w:numId w:val="30"/>
         </w:numPr>
       </w:pPr>
-      <w:proofErr w:type="spellStart"/>
-      <w:r>
-        <w:t>updateStatus</w:t>
-      </w:r>
-      <w:proofErr w:type="spellEnd"/>
-      <w:r>
-        <w:t>()</w:t>
+      <w:r>
+        <w:t>updateStatus()</w:t>
       </w:r>
     </w:p>
     <w:p/>
@@ -764,11 +685,9 @@
       <w:pPr>
         <w:pStyle w:val="Heading3"/>
       </w:pPr>
-      <w:proofErr w:type="spellStart"/>
       <w:r>
         <w:t>OrderItem</w:t>
       </w:r>
-      <w:proofErr w:type="spellEnd"/>
     </w:p>
     <w:p>
       <w:r>
@@ -809,13 +728,8 @@
           <w:numId w:val="32"/>
         </w:numPr>
       </w:pPr>
-      <w:proofErr w:type="spellStart"/>
-      <w:r>
-        <w:t>calculateSubtotal</w:t>
-      </w:r>
-      <w:proofErr w:type="spellEnd"/>
-      <w:r>
-        <w:t>()</w:t>
+      <w:r>
+        <w:t>calculateSubtotal()</w:t>
       </w:r>
     </w:p>
     <w:p/>
@@ -840,11 +754,9 @@
           <w:numId w:val="33"/>
         </w:numPr>
       </w:pPr>
-      <w:proofErr w:type="spellStart"/>
       <w:r>
         <w:t>paymentId</w:t>
       </w:r>
-      <w:proofErr w:type="spellEnd"/>
     </w:p>
     <w:p>
       <w:pPr>
@@ -880,13 +792,8 @@
           <w:numId w:val="34"/>
         </w:numPr>
       </w:pPr>
-      <w:proofErr w:type="spellStart"/>
-      <w:r>
-        <w:t>processPayment</w:t>
-      </w:r>
-      <w:proofErr w:type="spellEnd"/>
-      <w:r>
-        <w:t>()</w:t>
+      <w:r>
+        <w:t>processPayment()</w:t>
       </w:r>
     </w:p>
     <w:p>
@@ -896,13 +803,8 @@
           <w:numId w:val="34"/>
         </w:numPr>
       </w:pPr>
-      <w:proofErr w:type="spellStart"/>
-      <w:r>
-        <w:t>refundPayment</w:t>
-      </w:r>
-      <w:proofErr w:type="spellEnd"/>
-      <w:r>
-        <w:t>()</w:t>
+      <w:r>
+        <w:t>refundPayment()</w:t>
       </w:r>
     </w:p>
     <w:p/>
@@ -953,13 +855,8 @@
           <w:numId w:val="36"/>
         </w:numPr>
       </w:pPr>
-      <w:proofErr w:type="spellStart"/>
-      <w:r>
-        <w:t>submitReview</w:t>
-      </w:r>
-      <w:proofErr w:type="spellEnd"/>
-      <w:r>
-        <w:t>()</w:t>
+      <w:r>
+        <w:t>submitReview()</w:t>
       </w:r>
     </w:p>
     <w:p/>
@@ -1040,17 +937,8 @@
           <w:b/>
           <w:bCs/>
         </w:rPr>
-        <w:t xml:space="preserve">Order → </w:t>
-      </w:r>
-      <w:proofErr w:type="spellStart"/>
-      <w:r>
-        <w:rPr>
-          <w:b/>
-          <w:bCs/>
-        </w:rPr>
-        <w:t>OrderItem</w:t>
-      </w:r>
-      <w:proofErr w:type="spellEnd"/>
+        <w:t>Order → OrderItem</w:t>
+      </w:r>
     </w:p>
     <w:p>
       <w:pPr>
@@ -1063,15 +951,7 @@
         <w:spacing w:line="480" w:lineRule="auto"/>
       </w:pPr>
       <w:r>
-        <w:t xml:space="preserve">1 Order contains 1..* </w:t>
-      </w:r>
-      <w:proofErr w:type="spellStart"/>
-      <w:r>
-        <w:t>OrderItems</w:t>
-      </w:r>
-      <w:proofErr w:type="spellEnd"/>
-      <w:r>
-        <w:t xml:space="preserve"> (composition)</w:t>
+        <w:t>1 Order contains 1..* OrderItems (composition)</w:t>
       </w:r>
     </w:p>
     <w:p>
@@ -1084,31 +964,13 @@
         </w:numPr>
         <w:spacing w:line="480" w:lineRule="auto"/>
       </w:pPr>
-      <w:proofErr w:type="spellStart"/>
       <w:r>
         <w:rPr>
           <w:b/>
           <w:bCs/>
         </w:rPr>
-        <w:t>OrderItem</w:t>
-      </w:r>
-      <w:proofErr w:type="spellEnd"/>
-      <w:r>
-        <w:rPr>
-          <w:b/>
-          <w:bCs/>
-        </w:rPr>
-        <w:t xml:space="preserve"> → </w:t>
-      </w:r>
-      <w:proofErr w:type="spellStart"/>
-      <w:r>
-        <w:rPr>
-          <w:b/>
-          <w:bCs/>
-        </w:rPr>
-        <w:t>MenuItem</w:t>
-      </w:r>
-      <w:proofErr w:type="spellEnd"/>
+        <w:t>OrderItem → MenuItem</w:t>
+      </w:r>
     </w:p>
     <w:p>
       <w:pPr>
@@ -1121,21 +983,8 @@
         <w:spacing w:line="480" w:lineRule="auto"/>
       </w:pPr>
       <w:r>
-        <w:t xml:space="preserve">Each </w:t>
-      </w:r>
-      <w:proofErr w:type="spellStart"/>
-      <w:r>
-        <w:t>OrderItem</w:t>
-      </w:r>
-      <w:proofErr w:type="spellEnd"/>
-      <w:r>
-        <w:t xml:space="preserve"> refers to 1 </w:t>
-      </w:r>
-      <w:proofErr w:type="spellStart"/>
-      <w:r>
-        <w:t>MenuItem</w:t>
-      </w:r>
-      <w:proofErr w:type="spellEnd"/>
+        <w:t>Each OrderItem refers to 1 MenuItem</w:t>
+      </w:r>
     </w:p>
     <w:p>
       <w:pPr>
@@ -1152,17 +1001,8 @@
           <w:b/>
           <w:bCs/>
         </w:rPr>
-        <w:t xml:space="preserve">Restaurant → </w:t>
-      </w:r>
-      <w:proofErr w:type="spellStart"/>
-      <w:r>
-        <w:rPr>
-          <w:b/>
-          <w:bCs/>
-        </w:rPr>
-        <w:t>MenuItem</w:t>
-      </w:r>
-      <w:proofErr w:type="spellEnd"/>
+        <w:t>Restaurant → MenuItem</w:t>
+      </w:r>
     </w:p>
     <w:p>
       <w:pPr>
@@ -1175,13 +1015,8 @@
         <w:spacing w:line="480" w:lineRule="auto"/>
       </w:pPr>
       <w:r>
-        <w:t xml:space="preserve">1 Restaurant has 0..* </w:t>
-      </w:r>
-      <w:proofErr w:type="spellStart"/>
-      <w:r>
-        <w:t>MenuItems</w:t>
-      </w:r>
-      <w:proofErr w:type="spellEnd"/>
+        <w:t>1 Restaurant has 0..* MenuItems</w:t>
+      </w:r>
     </w:p>
     <w:p>
       <w:pPr>
@@ -1400,15 +1235,7 @@
         <w:t>ing</w:t>
       </w:r>
       <w:r>
-        <w:t xml:space="preserve"> Order and </w:t>
-      </w:r>
-      <w:proofErr w:type="spellStart"/>
-      <w:r>
-        <w:t>OrderItem</w:t>
-      </w:r>
-      <w:proofErr w:type="spellEnd"/>
-      <w:r>
-        <w:t xml:space="preserve"> properly (this is a big one)</w:t>
+        <w:t xml:space="preserve"> Order and OrderItem properly (this is a big one)</w:t>
       </w:r>
     </w:p>
     <w:p>
@@ -1446,18 +1273,10 @@
     </w:p>
     <w:p>
       <w:pPr>
-        <w:pStyle w:val="Heading2"/>
-      </w:pPr>
-      <w:r>
-        <w:t xml:space="preserve">1. Missing </w:t>
-      </w:r>
-      <w:proofErr w:type="spellStart"/>
-      <w:r>
-        <w:t>OrderItem</w:t>
-      </w:r>
-      <w:proofErr w:type="spellEnd"/>
-      <w:r>
-        <w:t xml:space="preserve"> </w:t>
+        <w:pStyle w:val="Heading3"/>
+      </w:pPr>
+      <w:r>
+        <w:t xml:space="preserve">1. Missing OrderItem </w:t>
       </w:r>
       <w:r>
         <w:t xml:space="preserve"> </w:t>
@@ -1471,15 +1290,7 @@
         </w:numPr>
       </w:pPr>
       <w:r>
-        <w:t xml:space="preserve">Order → </w:t>
-      </w:r>
-      <w:proofErr w:type="spellStart"/>
-      <w:r>
-        <w:t>MenuItem</w:t>
-      </w:r>
-      <w:proofErr w:type="spellEnd"/>
-      <w:r>
-        <w:t xml:space="preserve"> (directly)</w:t>
+        <w:t>Order → MenuItem (directly)</w:t>
       </w:r>
     </w:p>
     <w:p>
@@ -1527,27 +1338,18 @@
       <w:r>
         <w:t xml:space="preserve">Use </w:t>
       </w:r>
-      <w:proofErr w:type="spellStart"/>
       <w:r>
         <w:rPr>
           <w:b/>
           <w:bCs/>
         </w:rPr>
-        <w:t>OrderItem</w:t>
-      </w:r>
-      <w:proofErr w:type="spellEnd"/>
-      <w:r>
-        <w:rPr>
-          <w:b/>
-          <w:bCs/>
-        </w:rPr>
-        <w:t xml:space="preserve"> as a linking class</w:t>
+        <w:t>OrderItem as a linking class</w:t>
       </w:r>
     </w:p>
     <w:p/>
     <w:p>
       <w:pPr>
-        <w:pStyle w:val="Heading2"/>
+        <w:pStyle w:val="Heading3"/>
       </w:pPr>
       <w:r>
         <w:t>2. No Inheritance</w:t>
@@ -1618,7 +1420,7 @@
     <w:p/>
     <w:p>
       <w:pPr>
-        <w:pStyle w:val="Heading2"/>
+        <w:pStyle w:val="Heading3"/>
       </w:pPr>
       <w:r>
         <w:t>3. Incorrect Multiplicity</w:t>
@@ -1637,13 +1439,8 @@
         </w:numPr>
       </w:pPr>
       <w:r>
-        <w:t xml:space="preserve">One Order → One </w:t>
-      </w:r>
-      <w:proofErr w:type="spellStart"/>
-      <w:r>
-        <w:t>MenuItem</w:t>
-      </w:r>
-      <w:proofErr w:type="spellEnd"/>
+        <w:t>One Order → One MenuItem</w:t>
+      </w:r>
     </w:p>
     <w:p>
       <w:pPr>
@@ -1686,7 +1483,7 @@
     <w:p/>
     <w:p>
       <w:pPr>
-        <w:pStyle w:val="Heading2"/>
+        <w:pStyle w:val="Heading3"/>
       </w:pPr>
       <w:r>
         <w:t>4. Putting Too Much in One Class</w:t>
@@ -1750,7 +1547,7 @@
     <w:p/>
     <w:p>
       <w:pPr>
-        <w:pStyle w:val="Heading2"/>
+        <w:pStyle w:val="Heading3"/>
       </w:pPr>
       <w:r>
         <w:t>5. Missing Behaviour (Methods)</w:t>
@@ -1773,13 +1570,8 @@
           <w:numId w:val="50"/>
         </w:numPr>
       </w:pPr>
-      <w:proofErr w:type="spellStart"/>
-      <w:r>
-        <w:t>calculateTotal</w:t>
-      </w:r>
-      <w:proofErr w:type="spellEnd"/>
-      <w:r>
-        <w:t>()</w:t>
+      <w:r>
+        <w:t>calculateTotal()</w:t>
       </w:r>
     </w:p>
     <w:p>
@@ -1789,13 +1581,8 @@
           <w:numId w:val="50"/>
         </w:numPr>
       </w:pPr>
-      <w:proofErr w:type="spellStart"/>
-      <w:r>
-        <w:t>updateStatus</w:t>
-      </w:r>
-      <w:proofErr w:type="spellEnd"/>
-      <w:r>
-        <w:t>()</w:t>
+      <w:r>
+        <w:t>updateStatus()</w:t>
       </w:r>
     </w:p>
     <w:p>
@@ -1805,13 +1592,8 @@
           <w:numId w:val="50"/>
         </w:numPr>
       </w:pPr>
-      <w:proofErr w:type="spellStart"/>
-      <w:r>
-        <w:t>acceptOrder</w:t>
-      </w:r>
-      <w:proofErr w:type="spellEnd"/>
-      <w:r>
-        <w:t>()</w:t>
+      <w:r>
+        <w:t>acceptOrder()</w:t>
       </w:r>
       <w:r>
         <w:br/>
@@ -1839,16 +1621,9 @@
     <w:p/>
     <w:p>
       <w:pPr>
-        <w:rPr>
-          <w:b/>
-          <w:bCs/>
-        </w:rPr>
-      </w:pPr>
-      <w:r>
-        <w:rPr>
-          <w:b/>
-          <w:bCs/>
-        </w:rPr>
+        <w:pStyle w:val="Heading3"/>
+      </w:pPr>
+      <w:r>
         <w:lastRenderedPageBreak/>
         <w:t>6. No Status Modelling</w:t>
       </w:r>
@@ -1882,13 +1657,8 @@
         </w:numPr>
       </w:pPr>
       <w:r>
-        <w:t xml:space="preserve">status attribute or </w:t>
-      </w:r>
-      <w:proofErr w:type="spellStart"/>
-      <w:r>
-        <w:t>enum</w:t>
-      </w:r>
-      <w:proofErr w:type="spellEnd"/>
+        <w:t>status attribute or enum</w:t>
+      </w:r>
     </w:p>
     <w:p>
       <w:pPr>
@@ -1901,25 +1671,12 @@
         <w:t>controlled updates via methods</w:t>
       </w:r>
     </w:p>
-    <w:p>
-      <w:r>
-        <w:pict w14:anchorId="07CA5BB5">
-          <v:rect id="_x0000_i1025" style="width:0;height:1.5pt" o:hralign="center" o:hrstd="t" o:hr="t" fillcolor="#a0a0a0" stroked="f"/>
-        </w:pict>
-      </w:r>
-    </w:p>
-    <w:p>
-      <w:pPr>
-        <w:rPr>
-          <w:b/>
-          <w:bCs/>
-        </w:rPr>
-      </w:pPr>
-      <w:r>
-        <w:rPr>
-          <w:b/>
-          <w:bCs/>
-        </w:rPr>
+    <w:p/>
+    <w:p>
+      <w:pPr>
+        <w:pStyle w:val="Heading3"/>
+      </w:pPr>
+      <w:r>
         <w:t>7. Weak Naming</w:t>
       </w:r>
     </w:p>
@@ -1952,36 +1709,15 @@
         </w:numPr>
       </w:pPr>
       <w:r>
-        <w:t xml:space="preserve">Clear domain names like Order, </w:t>
-      </w:r>
-      <w:proofErr w:type="spellStart"/>
-      <w:r>
-        <w:t>MenuItem</w:t>
-      </w:r>
-      <w:proofErr w:type="spellEnd"/>
-      <w:r>
-        <w:t>, Payment</w:t>
-      </w:r>
-    </w:p>
-    <w:p>
-      <w:r>
-        <w:pict w14:anchorId="792CDA49">
-          <v:rect id="_x0000_i1026" style="width:0;height:1.5pt" o:hralign="center" o:hrstd="t" o:hr="t" fillcolor="#a0a0a0" stroked="f"/>
-        </w:pict>
-      </w:r>
-    </w:p>
-    <w:p>
-      <w:pPr>
-        <w:rPr>
-          <w:b/>
-          <w:bCs/>
-        </w:rPr>
-      </w:pPr>
-      <w:r>
-        <w:rPr>
-          <w:b/>
-          <w:bCs/>
-        </w:rPr>
+        <w:t>Clear domain names like Order, MenuItem, Payment</w:t>
+      </w:r>
+    </w:p>
+    <w:p/>
+    <w:p>
+      <w:pPr>
+        <w:pStyle w:val="Heading3"/>
+      </w:pPr>
+      <w:r>
         <w:t>8. No Justification</w:t>
       </w:r>
     </w:p>
@@ -2017,25 +1753,12 @@
         <w:t>Why is this a separate class?</w:t>
       </w:r>
     </w:p>
-    <w:p>
-      <w:r>
-        <w:pict w14:anchorId="48BF10D0">
-          <v:rect id="_x0000_i1027" style="width:0;height:1.5pt" o:hralign="center" o:hrstd="t" o:hr="t" fillcolor="#a0a0a0" stroked="f"/>
-        </w:pict>
-      </w:r>
-    </w:p>
-    <w:p>
-      <w:pPr>
-        <w:rPr>
-          <w:b/>
-          <w:bCs/>
-        </w:rPr>
-      </w:pPr>
-      <w:r>
-        <w:rPr>
-          <w:b/>
-          <w:bCs/>
-        </w:rPr>
+    <w:p/>
+    <w:p>
+      <w:pPr>
+        <w:pStyle w:val="Heading3"/>
+      </w:pPr>
+      <w:r>
         <w:t>Optional Marking Tip</w:t>
       </w:r>
     </w:p>
@@ -2052,15 +1775,7 @@
         </w:numPr>
       </w:pPr>
       <w:r>
-        <w:t xml:space="preserve">Do they have </w:t>
-      </w:r>
-      <w:proofErr w:type="spellStart"/>
-      <w:r>
-        <w:t>OrderItem</w:t>
-      </w:r>
-      <w:proofErr w:type="spellEnd"/>
-      <w:r>
-        <w:t>? → if no, major gap</w:t>
+        <w:t>Do they have OrderItem? → if no, major gap</w:t>
       </w:r>
     </w:p>
     <w:p>
@@ -2086,54 +1801,56 @@
       </w:r>
     </w:p>
     <w:p>
-      <w:r>
-        <w:pict w14:anchorId="64F4E3C9">
-          <v:rect id="_x0000_i1028" style="width:0;height:1.5pt" o:hralign="center" o:hrstd="t" o:hr="t" fillcolor="#a0a0a0" stroked="f"/>
-        </w:pict>
-      </w:r>
-    </w:p>
-    <w:p>
-      <w:r>
-        <w:t>If you want next step, I can:</w:t>
-      </w:r>
-    </w:p>
-    <w:p>
-      <w:pPr>
-        <w:numPr>
-          <w:ilvl w:val="0"/>
-          <w:numId w:val="57"/>
-        </w:numPr>
-      </w:pPr>
-      <w:r>
-        <w:t xml:space="preserve">turn this into a </w:t>
-      </w:r>
+      <w:pPr>
+        <w:suppressAutoHyphens w:val="0"/>
+      </w:pPr>
+      <w:r>
+        <w:br w:type="page"/>
+      </w:r>
+    </w:p>
+    <w:p>
       <w:r>
         <w:rPr>
-          <w:b/>
-          <w:bCs/>
+          <w:noProof/>
         </w:rPr>
-        <w:t>marking rubric with bands (pass merit distinction)</w:t>
-      </w:r>
-    </w:p>
-    <w:p>
-      <w:pPr>
-        <w:numPr>
-          <w:ilvl w:val="0"/>
-          <w:numId w:val="57"/>
-        </w:numPr>
-      </w:pPr>
-      <w:r>
-        <w:t xml:space="preserve">or create a </w:t>
-      </w:r>
-      <w:r>
-        <w:rPr>
-          <w:b/>
-          <w:bCs/>
-        </w:rPr>
-        <w:t>partially completed diagram students must fix (great for weaker groups)</w:t>
-      </w:r>
-    </w:p>
-    <w:p/>
+        <w:lastRenderedPageBreak/>
+        <w:drawing>
+          <wp:inline distT="0" distB="0" distL="0" distR="0" wp14:anchorId="4EA97BF6" wp14:editId="01DF7619">
+            <wp:extent cx="5731510" cy="3541395"/>
+            <wp:effectExtent l="0" t="0" r="2540" b="1905"/>
+            <wp:docPr id="718407622" name="Picture 1"/>
+            <wp:cNvGraphicFramePr>
+              <a:graphicFrameLocks xmlns:a="http://schemas.openxmlformats.org/drawingml/2006/main" noChangeAspect="1"/>
+            </wp:cNvGraphicFramePr>
+            <a:graphic xmlns:a="http://schemas.openxmlformats.org/drawingml/2006/main">
+              <a:graphicData uri="http://schemas.openxmlformats.org/drawingml/2006/picture">
+                <pic:pic xmlns:pic="http://schemas.openxmlformats.org/drawingml/2006/picture">
+                  <pic:nvPicPr>
+                    <pic:cNvPr id="718407622" name=""/>
+                    <pic:cNvPicPr/>
+                  </pic:nvPicPr>
+                  <pic:blipFill>
+                    <a:blip r:embed="rId5"/>
+                    <a:stretch>
+                      <a:fillRect/>
+                    </a:stretch>
+                  </pic:blipFill>
+                  <pic:spPr>
+                    <a:xfrm>
+                      <a:off x="0" y="0"/>
+                      <a:ext cx="5731510" cy="3541395"/>
+                    </a:xfrm>
+                    <a:prstGeom prst="rect">
+                      <a:avLst/>
+                    </a:prstGeom>
+                  </pic:spPr>
+                </pic:pic>
+              </a:graphicData>
+            </a:graphic>
+          </wp:inline>
+        </w:drawing>
+      </w:r>
+    </w:p>
     <w:sectPr>
       <w:pgSz w:w="11906" w:h="16838"/>
       <w:pgMar w:top="1440" w:right="1440" w:bottom="1440" w:left="1440" w:header="708" w:footer="708" w:gutter="0"/>

</xml_diff>